<commit_message>
test(uptae): update file test
</commit_message>
<xml_diff>
--- a/Slot4/DE190477_Test_Postman.docx
+++ b/Slot4/DE190477_Test_Postman.docx
@@ -6,6 +6,139 @@
       <w:pPr>
         <w:bidi w:val="0"/>
       </w:pPr>
+      <w:r>
+        <w:rPr>
+          <w:rFonts w:hint="default"/>
+          <w:b/>
+          <w:bCs/>
+          <w:lang w:val="en-US"/>
+        </w:rPr>
+        <w:t>DE190477_NguyenThanhLong</w:t>
+      </w:r>
+      <w:r>
+        <w:rPr>
+          <w:rFonts w:hint="default"/>
+          <w:b/>
+          <w:bCs/>
+          <w:lang w:val="en-US"/>
+        </w:rPr>
+        <w:br w:type="textWrapping"/>
+      </w:r>
+      <w:r>
+        <w:rPr>
+          <w:rFonts w:hint="default"/>
+          <w:b/>
+          <w:bCs/>
+          <w:lang w:val="en-US"/>
+        </w:rPr>
+        <w:t>D</w:t>
+      </w:r>
+      <w:r>
+        <w:rPr>
+          <w:rFonts w:hint="default"/>
+          <w:b/>
+          <w:bCs/>
+          <w:lang w:val="vi-VN"/>
+        </w:rPr>
+        <w:t>ựa vào Guild Test</w:t>
+      </w:r>
+      <w:r>
+        <w:rPr>
+          <w:rFonts w:hint="default"/>
+          <w:b/>
+          <w:bCs/>
+          <w:lang w:val="vi-VN"/>
+        </w:rPr>
+        <w:br w:type="textWrapping"/>
+      </w:r>
+      <w:r>
+        <w:drawing>
+          <wp:inline distT="0" distB="0" distL="114300" distR="114300">
+            <wp:extent cx="5270500" cy="1616075"/>
+            <wp:effectExtent l="0" t="0" r="2540" b="14605"/>
+            <wp:docPr id="3" name="Picture 1"/>
+            <wp:cNvGraphicFramePr>
+              <a:graphicFrameLocks xmlns:a="http://schemas.openxmlformats.org/drawingml/2006/main" noChangeAspect="1"/>
+            </wp:cNvGraphicFramePr>
+            <a:graphic xmlns:a="http://schemas.openxmlformats.org/drawingml/2006/main">
+              <a:graphicData uri="http://schemas.openxmlformats.org/drawingml/2006/picture">
+                <pic:pic xmlns:pic="http://schemas.openxmlformats.org/drawingml/2006/picture">
+                  <pic:nvPicPr>
+                    <pic:cNvPr id="3" name="Picture 1"/>
+                    <pic:cNvPicPr>
+                      <a:picLocks noChangeAspect="1"/>
+                    </pic:cNvPicPr>
+                  </pic:nvPicPr>
+                  <pic:blipFill>
+                    <a:blip r:embed="rId4"/>
+                    <a:stretch>
+                      <a:fillRect/>
+                    </a:stretch>
+                  </pic:blipFill>
+                  <pic:spPr>
+                    <a:xfrm>
+                      <a:off x="0" y="0"/>
+                      <a:ext cx="5270500" cy="1616075"/>
+                    </a:xfrm>
+                    <a:prstGeom prst="rect">
+                      <a:avLst/>
+                    </a:prstGeom>
+                    <a:noFill/>
+                    <a:ln>
+                      <a:noFill/>
+                    </a:ln>
+                  </pic:spPr>
+                </pic:pic>
+              </a:graphicData>
+            </a:graphic>
+          </wp:inline>
+        </w:drawing>
+      </w:r>
+    </w:p>
+    <w:p>
+      <w:pPr>
+        <w:bidi w:val="0"/>
+        <w:jc w:val="center"/>
+        <w:rPr>
+          <w:rFonts w:hint="default"/>
+          <w:lang w:val="vi-VN"/>
+        </w:rPr>
+      </w:pPr>
+      <w:r>
+        <w:rPr>
+          <w:rFonts w:hint="default"/>
+          <w:lang w:val="vi-VN"/>
+        </w:rPr>
+        <w:t>Em đã viết ra bàng báo cáo test dưới đây.(Toàn bộ đều past hết)</w:t>
+      </w:r>
+      <w:r>
+        <w:rPr>
+          <w:rFonts w:hint="default"/>
+          <w:lang w:val="vi-VN"/>
+        </w:rPr>
+        <w:br w:type="textWrapping"/>
+      </w:r>
+    </w:p>
+    <w:p>
+      <w:pPr>
+        <w:bidi w:val="0"/>
+        <w:jc w:val="center"/>
+        <w:rPr>
+          <w:rFonts w:hint="default"/>
+          <w:b/>
+          <w:bCs/>
+          <w:lang w:val="vi-VN"/>
+        </w:rPr>
+      </w:pPr>
+      <w:r>
+        <w:rPr>
+          <w:rFonts w:hint="default"/>
+          <w:b/>
+          <w:bCs/>
+          <w:lang w:val="vi-VN"/>
+        </w:rPr>
+        <w:t>Test Document</w:t>
+      </w:r>
       <w:bookmarkStart w:id="0" w:name="_GoBack"/>
       <w:bookmarkEnd w:id="0"/>
     </w:p>
@@ -30,7 +163,7 @@
                     </pic:cNvPicPr>
                   </pic:nvPicPr>
                   <pic:blipFill>
-                    <a:blip r:embed="rId4"/>
+                    <a:blip r:embed="rId5"/>
                     <a:stretch>
                       <a:fillRect/>
                     </a:stretch>
@@ -76,7 +209,7 @@
                     </pic:cNvPicPr>
                   </pic:nvPicPr>
                   <pic:blipFill>
-                    <a:blip r:embed="rId5"/>
+                    <a:blip r:embed="rId6"/>
                     <a:stretch>
                       <a:fillRect/>
                     </a:stretch>
@@ -364,7 +497,7 @@
     <w:lsdException w:qFormat="1" w:uiPriority="0" w:name="heading 9"/>
     <w:lsdException w:unhideWhenUsed="0" w:uiPriority="0" w:semiHidden="0" w:name="index 1"/>
     <w:lsdException w:qFormat="1" w:unhideWhenUsed="0" w:uiPriority="0" w:semiHidden="0" w:name="index 2"/>
-    <w:lsdException w:unhideWhenUsed="0" w:uiPriority="0" w:semiHidden="0" w:name="index 3"/>
+    <w:lsdException w:qFormat="1" w:unhideWhenUsed="0" w:uiPriority="0" w:semiHidden="0" w:name="index 3"/>
     <w:lsdException w:unhideWhenUsed="0" w:uiPriority="0" w:semiHidden="0" w:name="index 4"/>
     <w:lsdException w:unhideWhenUsed="0" w:uiPriority="0" w:semiHidden="0" w:name="index 5"/>
     <w:lsdException w:qFormat="1" w:unhideWhenUsed="0" w:uiPriority="0" w:semiHidden="0" w:name="index 6"/>
@@ -400,7 +533,7 @@
     <w:lsdException w:unhideWhenUsed="0" w:uiPriority="0" w:semiHidden="0" w:name="macro"/>
     <w:lsdException w:unhideWhenUsed="0" w:uiPriority="0" w:semiHidden="0" w:name="toa heading"/>
     <w:lsdException w:qFormat="1" w:unhideWhenUsed="0" w:uiPriority="0" w:semiHidden="0" w:name="List"/>
-    <w:lsdException w:unhideWhenUsed="0" w:uiPriority="0" w:semiHidden="0" w:name="List Bullet"/>
+    <w:lsdException w:qFormat="1" w:unhideWhenUsed="0" w:uiPriority="0" w:semiHidden="0" w:name="List Bullet"/>
     <w:lsdException w:qFormat="1" w:unhideWhenUsed="0" w:uiPriority="0" w:semiHidden="0" w:name="List Number"/>
     <w:lsdException w:qFormat="1" w:unhideWhenUsed="0" w:uiPriority="0" w:semiHidden="0" w:name="List 2"/>
     <w:lsdException w:qFormat="1" w:unhideWhenUsed="0" w:uiPriority="0" w:semiHidden="0" w:name="List 3"/>
@@ -424,7 +557,7 @@
     <w:lsdException w:qFormat="1" w:unhideWhenUsed="0" w:uiPriority="0" w:semiHidden="0" w:name="List Continue 2"/>
     <w:lsdException w:qFormat="1" w:unhideWhenUsed="0" w:uiPriority="0" w:semiHidden="0" w:name="List Continue 3"/>
     <w:lsdException w:unhideWhenUsed="0" w:uiPriority="0" w:semiHidden="0" w:name="List Continue 4"/>
-    <w:lsdException w:unhideWhenUsed="0" w:uiPriority="0" w:semiHidden="0" w:name="List Continue 5"/>
+    <w:lsdException w:qFormat="1" w:unhideWhenUsed="0" w:uiPriority="0" w:semiHidden="0" w:name="List Continue 5"/>
     <w:lsdException w:qFormat="1" w:unhideWhenUsed="0" w:uiPriority="0" w:semiHidden="0" w:name="Message Header"/>
     <w:lsdException w:qFormat="1" w:unhideWhenUsed="0" w:uiPriority="0" w:semiHidden="0" w:name="Subtitle"/>
     <w:lsdException w:qFormat="1" w:unhideWhenUsed="0" w:uiPriority="0" w:semiHidden="0" w:name="Salutation"/>
@@ -432,7 +565,7 @@
     <w:lsdException w:qFormat="1" w:unhideWhenUsed="0" w:uiPriority="0" w:semiHidden="0" w:name="Body Text First Indent"/>
     <w:lsdException w:unhideWhenUsed="0" w:uiPriority="0" w:semiHidden="0" w:name="Body Text First Indent 2"/>
     <w:lsdException w:qFormat="1" w:unhideWhenUsed="0" w:uiPriority="0" w:semiHidden="0" w:name="Note Heading"/>
-    <w:lsdException w:unhideWhenUsed="0" w:uiPriority="0" w:semiHidden="0" w:name="Body Text 2"/>
+    <w:lsdException w:qFormat="1" w:unhideWhenUsed="0" w:uiPriority="0" w:semiHidden="0" w:name="Body Text 2"/>
     <w:lsdException w:qFormat="1" w:unhideWhenUsed="0" w:uiPriority="0" w:semiHidden="0" w:name="Body Text 3"/>
     <w:lsdException w:qFormat="1" w:unhideWhenUsed="0" w:uiPriority="0" w:semiHidden="0" w:name="Body Text Indent 2"/>
     <w:lsdException w:qFormat="1" w:unhideWhenUsed="0" w:uiPriority="0" w:semiHidden="0" w:name="Body Text Indent 3"/>
@@ -445,7 +578,7 @@
     <w:lsdException w:qFormat="1" w:unhideWhenUsed="0" w:uiPriority="0" w:semiHidden="0" w:name="Plain Text"/>
     <w:lsdException w:qFormat="1" w:unhideWhenUsed="0" w:uiPriority="0" w:semiHidden="0" w:name="E-mail Signature"/>
     <w:lsdException w:qFormat="1" w:unhideWhenUsed="0" w:uiPriority="0" w:semiHidden="0" w:name="Normal (Web)"/>
-    <w:lsdException w:unhideWhenUsed="0" w:uiPriority="0" w:semiHidden="0" w:name="HTML Acronym"/>
+    <w:lsdException w:qFormat="1" w:unhideWhenUsed="0" w:uiPriority="0" w:semiHidden="0" w:name="HTML Acronym"/>
     <w:lsdException w:qFormat="1" w:unhideWhenUsed="0" w:uiPriority="0" w:semiHidden="0" w:name="HTML Address"/>
     <w:lsdException w:qFormat="1" w:unhideWhenUsed="0" w:uiPriority="0" w:semiHidden="0" w:name="HTML Cite"/>
     <w:lsdException w:qFormat="1" w:unhideWhenUsed="0" w:uiPriority="0" w:semiHidden="0" w:name="HTML Code"/>
@@ -845,6 +978,7 @@
   <w:style w:type="paragraph" w:styleId="16">
     <w:name w:val="Body Text 2"/>
     <w:basedOn w:val="1"/>
+    <w:qFormat/>
     <w:uiPriority w:val="0"/>
     <w:pPr>
       <w:spacing w:after="120" w:line="480" w:lineRule="auto"/>
@@ -1117,6 +1251,7 @@
   <w:style w:type="character" w:styleId="41">
     <w:name w:val="HTML Acronym"/>
     <w:basedOn w:val="11"/>
+    <w:qFormat/>
     <w:uiPriority w:val="0"/>
   </w:style>
   <w:style w:type="paragraph" w:styleId="42">
@@ -1239,6 +1374,7 @@
     <w:name w:val="index 3"/>
     <w:basedOn w:val="1"/>
     <w:next w:val="1"/>
+    <w:qFormat/>
     <w:uiPriority w:val="0"/>
     <w:pPr>
       <w:ind w:left="400" w:leftChars="400"/>
@@ -1367,6 +1503,7 @@
   <w:style w:type="paragraph" w:styleId="68">
     <w:name w:val="List Bullet"/>
     <w:basedOn w:val="1"/>
+    <w:qFormat/>
     <w:uiPriority w:val="0"/>
     <w:pPr>
       <w:numPr>
@@ -1464,6 +1601,7 @@
   <w:style w:type="paragraph" w:styleId="77">
     <w:name w:val="List Continue 5"/>
     <w:basedOn w:val="1"/>
+    <w:qFormat/>
     <w:uiPriority w:val="0"/>
     <w:pPr>
       <w:spacing w:after="120"/>

</xml_diff>